<commit_message>
feat: Enhance document request detail and applicant dashboard
feat: Enhance document request detail and applicant dashboard

- Updated request_detail.html to improve the display of document statuses and download options for completed documents.
- Modified dashboard.html to refine the step labels and statuses for better clarity during the application process.
- Added new tests for document handling and expert selection in the application process, ensuring proper functionality and user experience.
- Introduced ApprovedRankBackfill service to update academic positions based on council approvals upon application startup.
- Created new tests for council approval steps and expert list validation, ensuring compliance with application requirements.
- Implemented end-to-end tests for document forms, focusing on dropdown selections and expert row management.
</commit_message>
<xml_diff>
--- a/HRCP-KKU-Academic/src/main/resources/templates/docx/Phase2/p2doc_8.docx
+++ b/HRCP-KKU-Academic/src/main/resources/templates/docx/Phase2/p2doc_8.docx
@@ -2870,6 +2870,7 @@
       </w:tr>
       <w:tr>
         <w:trPr>
+          <w:cantSplit/>
           <w:trHeight w:val="265"/>
         </w:trPr>
         <w:tc>
@@ -2913,6 +2914,7 @@
           <w:p>
             <w:pPr>
               <w:ind w:left="34" w:firstLine="0"/>
+              <w:jc w:val="left"/>
               <w:rPr>
                 <w:rFonts w:ascii="TH Sarabun New" w:hAnsi="TH Sarabun New" w:cs="TH Sarabun New"/>
                 <w:color w:val="000000"/>
@@ -2938,6 +2940,7 @@
           <w:p>
             <w:pPr>
               <w:ind w:left="34" w:firstLine="0"/>
+              <w:jc w:val="left"/>
               <w:rPr>
                 <w:rFonts w:ascii="TH Sarabun New" w:hAnsi="TH Sarabun New" w:cs="TH Sarabun New"/>
                 <w:color w:val="000000"/>
@@ -2963,6 +2966,7 @@
           <w:p>
             <w:pPr>
               <w:ind w:left="34" w:firstLine="0"/>
+              <w:jc w:val="left"/>
               <w:rPr>
                 <w:rFonts w:ascii="TH Sarabun New" w:hAnsi="TH Sarabun New" w:cs="TH Sarabun New"/>
                 <w:color w:val="000000"/>
@@ -2988,6 +2992,7 @@
           <w:p>
             <w:pPr>
               <w:ind w:left="34" w:firstLine="0"/>
+              <w:jc w:val="left"/>
               <w:rPr>
                 <w:rFonts w:ascii="TH Sarabun New" w:hAnsi="TH Sarabun New" w:cs="TH Sarabun New"/>
                 <w:color w:val="000000"/>
@@ -3010,6 +3015,7 @@
       </w:tr>
       <w:tr>
         <w:trPr>
+          <w:cantSplit/>
           <w:trHeight w:val="333"/>
         </w:trPr>
         <w:tc>
@@ -3053,6 +3059,7 @@
           <w:p>
             <w:pPr>
               <w:ind w:left="34" w:firstLine="0"/>
+              <w:jc w:val="left"/>
               <w:rPr>
                 <w:rFonts w:ascii="TH Sarabun New" w:hAnsi="TH Sarabun New" w:cs="TH Sarabun New"/>
                 <w:color w:val="000000"/>
@@ -3078,6 +3085,7 @@
           <w:p>
             <w:pPr>
               <w:ind w:left="34" w:firstLine="0"/>
+              <w:jc w:val="left"/>
               <w:rPr>
                 <w:rFonts w:ascii="TH Sarabun New" w:hAnsi="TH Sarabun New" w:cs="TH Sarabun New"/>
                 <w:color w:val="000000"/>
@@ -3121,6 +3129,7 @@
           <w:p>
             <w:pPr>
               <w:ind w:left="34" w:firstLine="0"/>
+              <w:jc w:val="left"/>
               <w:rPr>
                 <w:rFonts w:ascii="TH Sarabun New" w:hAnsi="TH Sarabun New" w:cs="TH Sarabun New"/>
                 <w:color w:val="000000"/>
@@ -3164,6 +3173,7 @@
           <w:p>
             <w:pPr>
               <w:ind w:left="34" w:firstLine="0"/>
+              <w:jc w:val="left"/>
               <w:rPr>
                 <w:rFonts w:ascii="TH Sarabun New" w:hAnsi="TH Sarabun New" w:cs="TH Sarabun New"/>
                 <w:color w:val="000000"/>
@@ -3186,6 +3196,7 @@
       </w:tr>
       <w:tr>
         <w:trPr>
+          <w:cantSplit/>
           <w:trHeight w:val="265"/>
         </w:trPr>
         <w:tc>
@@ -3229,6 +3240,7 @@
           <w:p>
             <w:pPr>
               <w:ind w:left="34" w:firstLine="0"/>
+              <w:jc w:val="left"/>
               <w:rPr>
                 <w:rFonts w:ascii="TH Sarabun New" w:hAnsi="TH Sarabun New" w:cs="TH Sarabun New"/>
                 <w:color w:val="000000"/>
@@ -3254,6 +3266,7 @@
           <w:p>
             <w:pPr>
               <w:ind w:left="34" w:firstLine="0"/>
+              <w:jc w:val="left"/>
               <w:rPr>
                 <w:rFonts w:ascii="TH Sarabun New" w:hAnsi="TH Sarabun New" w:cs="TH Sarabun New"/>
                 <w:color w:val="000000"/>
@@ -3297,6 +3310,7 @@
           <w:p>
             <w:pPr>
               <w:ind w:left="34" w:firstLine="0"/>
+              <w:jc w:val="left"/>
               <w:rPr>
                 <w:rFonts w:ascii="TH Sarabun New" w:hAnsi="TH Sarabun New" w:cs="TH Sarabun New"/>
                 <w:color w:val="000000"/>
@@ -3340,6 +3354,7 @@
           <w:p>
             <w:pPr>
               <w:ind w:left="34" w:firstLine="0"/>
+              <w:jc w:val="left"/>
               <w:rPr>
                 <w:rFonts w:ascii="TH Sarabun New" w:hAnsi="TH Sarabun New" w:cs="TH Sarabun New"/>
                 <w:color w:val="000000"/>
@@ -3362,6 +3377,7 @@
       </w:tr>
       <w:tr>
         <w:trPr>
+          <w:cantSplit/>
           <w:trHeight w:val="265"/>
         </w:trPr>
         <w:tc>
@@ -3405,6 +3421,7 @@
           <w:p>
             <w:pPr>
               <w:ind w:left="34" w:firstLine="0"/>
+              <w:jc w:val="left"/>
               <w:rPr>
                 <w:rFonts w:ascii="TH Sarabun New" w:hAnsi="TH Sarabun New" w:cs="TH Sarabun New"/>
                 <w:color w:val="000000"/>
@@ -3430,6 +3447,7 @@
           <w:p>
             <w:pPr>
               <w:ind w:left="34" w:firstLine="0"/>
+              <w:jc w:val="left"/>
               <w:rPr>
                 <w:rFonts w:ascii="TH Sarabun New" w:hAnsi="TH Sarabun New" w:cs="TH Sarabun New"/>
                 <w:color w:val="000000"/>
@@ -3473,6 +3491,7 @@
           <w:p>
             <w:pPr>
               <w:ind w:left="34" w:firstLine="0"/>
+              <w:jc w:val="left"/>
               <w:rPr>
                 <w:rFonts w:ascii="TH Sarabun New" w:hAnsi="TH Sarabun New" w:cs="TH Sarabun New"/>
                 <w:color w:val="000000"/>
@@ -3516,6 +3535,7 @@
           <w:p>
             <w:pPr>
               <w:ind w:left="34" w:firstLine="0"/>
+              <w:jc w:val="left"/>
               <w:rPr>
                 <w:rFonts w:ascii="TH Sarabun New" w:hAnsi="TH Sarabun New" w:cs="TH Sarabun New"/>
                 <w:color w:val="000000"/>
@@ -3537,6 +3557,7 @@
       </w:tr>
       <w:tr>
         <w:trPr>
+          <w:cantSplit/>
           <w:trHeight w:val="265"/>
         </w:trPr>
         <w:tc>
@@ -3580,6 +3601,7 @@
           <w:p>
             <w:pPr>
               <w:ind w:left="34" w:firstLine="0"/>
+              <w:jc w:val="left"/>
               <w:rPr>
                 <w:rFonts w:ascii="TH Sarabun New" w:hAnsi="TH Sarabun New" w:cs="TH Sarabun New"/>
                 <w:color w:val="000000"/>
@@ -3605,6 +3627,7 @@
           <w:p>
             <w:pPr>
               <w:ind w:left="34" w:firstLine="0"/>
+              <w:jc w:val="left"/>
               <w:rPr>
                 <w:rFonts w:ascii="TH Sarabun New" w:hAnsi="TH Sarabun New" w:cs="TH Sarabun New"/>
                 <w:color w:val="000000"/>
@@ -3648,6 +3671,7 @@
           <w:p>
             <w:pPr>
               <w:ind w:left="34" w:firstLine="0"/>
+              <w:jc w:val="left"/>
               <w:rPr>
                 <w:rFonts w:ascii="TH Sarabun New" w:hAnsi="TH Sarabun New" w:cs="TH Sarabun New"/>
                 <w:color w:val="000000"/>
@@ -3691,6 +3715,7 @@
           <w:p>
             <w:pPr>
               <w:ind w:left="34" w:firstLine="0"/>
+              <w:jc w:val="left"/>
               <w:rPr>
                 <w:rFonts w:ascii="TH Sarabun New" w:hAnsi="TH Sarabun New" w:cs="TH Sarabun New"/>
                 <w:color w:val="000000"/>
@@ -3713,6 +3738,7 @@
       </w:tr>
       <w:tr>
         <w:trPr>
+          <w:cantSplit/>
           <w:trHeight w:val="265"/>
         </w:trPr>
         <w:tc>
@@ -3756,6 +3782,7 @@
           <w:p>
             <w:pPr>
               <w:ind w:left="34" w:firstLine="0"/>
+              <w:jc w:val="left"/>
               <w:rPr>
                 <w:rFonts w:ascii="TH Sarabun New" w:hAnsi="TH Sarabun New" w:cs="TH Sarabun New"/>
                 <w:color w:val="000000"/>
@@ -3799,6 +3826,7 @@
           <w:p>
             <w:pPr>
               <w:ind w:left="34" w:firstLine="0"/>
+              <w:jc w:val="left"/>
               <w:rPr>
                 <w:rFonts w:ascii="TH Sarabun New" w:hAnsi="TH Sarabun New" w:cs="TH Sarabun New"/>
                 <w:color w:val="000000"/>
@@ -3842,6 +3870,7 @@
           <w:p>
             <w:pPr>
               <w:ind w:left="34" w:firstLine="0"/>
+              <w:jc w:val="left"/>
               <w:rPr>
                 <w:rFonts w:ascii="TH Sarabun New" w:hAnsi="TH Sarabun New" w:cs="TH Sarabun New"/>
                 <w:color w:val="000000"/>
@@ -3885,6 +3914,7 @@
           <w:p>
             <w:pPr>
               <w:ind w:left="34" w:firstLine="0"/>
+              <w:jc w:val="left"/>
               <w:rPr>
                 <w:rFonts w:ascii="TH Sarabun New" w:hAnsi="TH Sarabun New" w:cs="TH Sarabun New"/>
                 <w:color w:val="000000"/>
@@ -3907,6 +3937,7 @@
       </w:tr>
       <w:tr>
         <w:trPr>
+          <w:cantSplit/>
           <w:trHeight w:val="255"/>
         </w:trPr>
         <w:tc>
@@ -3942,6 +3973,7 @@
           <w:p>
             <w:pPr>
               <w:ind w:left="34" w:firstLine="0"/>
+              <w:jc w:val="left"/>
               <w:rPr>
                 <w:rFonts w:ascii="TH Sarabun New" w:hAnsi="TH Sarabun New" w:cs="TH Sarabun New"/>
                 <w:color w:val="000000"/>
@@ -3967,6 +3999,7 @@
           <w:p>
             <w:pPr>
               <w:ind w:left="34" w:firstLine="0"/>
+              <w:jc w:val="left"/>
               <w:rPr>
                 <w:rFonts w:ascii="TH Sarabun New" w:hAnsi="TH Sarabun New" w:cs="TH Sarabun New"/>
                 <w:color w:val="000000"/>
@@ -4010,6 +4043,7 @@
           <w:p>
             <w:pPr>
               <w:ind w:left="34" w:firstLine="0"/>
+              <w:jc w:val="left"/>
               <w:rPr>
                 <w:rFonts w:ascii="TH Sarabun New" w:hAnsi="TH Sarabun New" w:cs="TH Sarabun New"/>
                 <w:color w:val="000000"/>
@@ -4053,6 +4087,7 @@
           <w:p>
             <w:pPr>
               <w:ind w:left="34" w:firstLine="0"/>
+              <w:jc w:val="left"/>
               <w:rPr>
                 <w:rFonts w:ascii="TH Sarabun New" w:hAnsi="TH Sarabun New" w:cs="TH Sarabun New"/>
                 <w:color w:val="000000"/>
@@ -4075,6 +4110,7 @@
       </w:tr>
       <w:tr>
         <w:trPr>
+          <w:cantSplit/>
           <w:trHeight w:val="265"/>
         </w:trPr>
         <w:tc>
@@ -4110,6 +4146,7 @@
           <w:p>
             <w:pPr>
               <w:ind w:left="34" w:firstLine="0"/>
+              <w:jc w:val="left"/>
               <w:rPr>
                 <w:rFonts w:ascii="TH Sarabun New" w:hAnsi="TH Sarabun New" w:cs="TH Sarabun New"/>
                 <w:color w:val="000000"/>
@@ -4135,6 +4172,7 @@
           <w:p>
             <w:pPr>
               <w:ind w:left="34" w:firstLine="0"/>
+              <w:jc w:val="left"/>
               <w:rPr>
                 <w:rFonts w:ascii="TH Sarabun New" w:hAnsi="TH Sarabun New" w:cs="TH Sarabun New"/>
                 <w:color w:val="000000"/>
@@ -4178,6 +4216,7 @@
           <w:p>
             <w:pPr>
               <w:ind w:left="34" w:firstLine="0"/>
+              <w:jc w:val="left"/>
               <w:rPr>
                 <w:rFonts w:ascii="TH Sarabun New" w:hAnsi="TH Sarabun New" w:cs="TH Sarabun New"/>
                 <w:color w:val="000000"/>
@@ -4221,6 +4260,7 @@
           <w:p>
             <w:pPr>
               <w:ind w:left="34" w:firstLine="0"/>
+              <w:jc w:val="left"/>
               <w:rPr>
                 <w:rFonts w:ascii="TH Sarabun New" w:hAnsi="TH Sarabun New" w:cs="TH Sarabun New"/>
                 <w:color w:val="000000"/>
@@ -4243,6 +4283,7 @@
       </w:tr>
       <w:tr>
         <w:trPr>
+          <w:cantSplit/>
           <w:trHeight w:val="265"/>
         </w:trPr>
         <w:tc>
@@ -4278,6 +4319,7 @@
           <w:p>
             <w:pPr>
               <w:ind w:left="34" w:firstLine="0"/>
+              <w:jc w:val="left"/>
               <w:rPr>
                 <w:rFonts w:ascii="TH Sarabun New" w:hAnsi="TH Sarabun New" w:cs="TH Sarabun New"/>
                 <w:color w:val="000000"/>
@@ -4303,6 +4345,7 @@
           <w:p>
             <w:pPr>
               <w:ind w:left="34" w:firstLine="0"/>
+              <w:jc w:val="left"/>
               <w:rPr>
                 <w:rFonts w:ascii="TH Sarabun New" w:hAnsi="TH Sarabun New" w:cs="TH Sarabun New"/>
                 <w:color w:val="000000"/>
@@ -4346,6 +4389,7 @@
           <w:p>
             <w:pPr>
               <w:ind w:left="34" w:firstLine="0"/>
+              <w:jc w:val="left"/>
               <w:rPr>
                 <w:rFonts w:ascii="TH Sarabun New" w:hAnsi="TH Sarabun New" w:cs="TH Sarabun New"/>
                 <w:color w:val="000000"/>
@@ -4389,6 +4433,7 @@
           <w:p>
             <w:pPr>
               <w:ind w:left="34" w:firstLine="0"/>
+              <w:jc w:val="left"/>
               <w:rPr>
                 <w:rFonts w:ascii="TH Sarabun New" w:hAnsi="TH Sarabun New" w:cs="TH Sarabun New"/>
                 <w:color w:val="000000"/>
@@ -4411,6 +4456,7 @@
       </w:tr>
       <w:tr>
         <w:trPr>
+          <w:cantSplit/>
           <w:trHeight w:val="265"/>
         </w:trPr>
         <w:tc>
@@ -4446,6 +4492,7 @@
           <w:p>
             <w:pPr>
               <w:ind w:left="34" w:firstLine="0"/>
+              <w:jc w:val="left"/>
               <w:rPr>
                 <w:rFonts w:ascii="TH Sarabun New" w:hAnsi="TH Sarabun New" w:cs="TH Sarabun New"/>
                 <w:color w:val="000000"/>
@@ -4471,6 +4518,7 @@
           <w:p>
             <w:pPr>
               <w:ind w:left="34" w:firstLine="0"/>
+              <w:jc w:val="left"/>
               <w:rPr>
                 <w:rFonts w:ascii="TH Sarabun New" w:hAnsi="TH Sarabun New" w:cs="TH Sarabun New"/>
                 <w:color w:val="000000"/>
@@ -4514,6 +4562,7 @@
           <w:p>
             <w:pPr>
               <w:ind w:left="34" w:firstLine="0"/>
+              <w:jc w:val="left"/>
               <w:rPr>
                 <w:rFonts w:ascii="TH Sarabun New" w:hAnsi="TH Sarabun New" w:cs="TH Sarabun New"/>
                 <w:color w:val="000000"/>
@@ -4557,6 +4606,7 @@
           <w:p>
             <w:pPr>
               <w:ind w:left="34" w:firstLine="0"/>
+              <w:jc w:val="left"/>
               <w:rPr>
                 <w:rFonts w:ascii="TH Sarabun New" w:hAnsi="TH Sarabun New" w:cs="TH Sarabun New"/>
                 <w:color w:val="000000"/>

</xml_diff>